<commit_message>
minor code adjustment and updated video link just in case (old link doesn't show pop-ups)
</commit_message>
<xml_diff>
--- a/report_milestone2.docx
+++ b/report_milestone2.docx
@@ -790,9 +790,6 @@
       <w:pPr>
         <w:jc w:val="center"/>
         <w:rPr>
-          <w:rFonts w:asciiTheme="majorBidi" w:hAnsiTheme="majorBidi" w:cstheme="majorBidi"/>
-          <w:b/>
-          <w:bCs/>
           <w:sz w:val="40"/>
           <w:szCs w:val="40"/>
         </w:rPr>
@@ -801,35 +798,26 @@
         <w:r>
           <w:rPr>
             <w:rStyle w:val="Hyperlink"/>
-            <w:rFonts w:asciiTheme="majorBidi" w:hAnsiTheme="majorBidi" w:cstheme="majorBidi"/>
-            <w:b/>
-            <w:bCs/>
             <w:sz w:val="40"/>
             <w:szCs w:val="40"/>
           </w:rPr>
-          <w:t>https://youtu.</w:t>
+          <w:t>https://youtu</w:t>
         </w:r>
         <w:r>
           <w:rPr>
             <w:rStyle w:val="Hyperlink"/>
-            <w:rFonts w:asciiTheme="majorBidi" w:hAnsiTheme="majorBidi" w:cstheme="majorBidi"/>
-            <w:b/>
-            <w:bCs/>
             <w:sz w:val="40"/>
             <w:szCs w:val="40"/>
           </w:rPr>
-          <w:t>b</w:t>
+          <w:t>.</w:t>
         </w:r>
         <w:r>
           <w:rPr>
             <w:rStyle w:val="Hyperlink"/>
-            <w:rFonts w:asciiTheme="majorBidi" w:hAnsiTheme="majorBidi" w:cstheme="majorBidi"/>
-            <w:b/>
-            <w:bCs/>
             <w:sz w:val="40"/>
             <w:szCs w:val="40"/>
           </w:rPr>
-          <w:t>e/lFSBCyaPz3o</w:t>
+          <w:t>be/LyMliF-_lkg</w:t>
         </w:r>
       </w:hyperlink>
     </w:p>

</xml_diff>